<commit_message>
NN Added in Stack
</commit_message>
<xml_diff>
--- a/07 Big Mart Sales Predictions/BigMart_Approach.docx
+++ b/07 Big Mart Sales Predictions/BigMart_Approach.docx
@@ -6,6 +6,7 @@
       <w:pPr>
         <w:spacing w:after="80"/>
       </w:pPr>
+      <w:proofErr w:type="spellStart"/>
       <w:r>
         <w:rPr>
           <w:b/>
@@ -14,7 +15,18 @@
           <w:sz w:val="52"/>
           <w:szCs w:val="52"/>
         </w:rPr>
-        <w:t>BigMart Sales Prediction</w:t>
+        <w:t>BigMart</w:t>
+      </w:r>
+      <w:proofErr w:type="spellEnd"/>
+      <w:r>
+        <w:rPr>
+          <w:b/>
+          <w:bCs/>
+          <w:color w:val="1F4E79"/>
+          <w:sz w:val="52"/>
+          <w:szCs w:val="52"/>
+        </w:rPr>
+        <w:t xml:space="preserve"> Sales Prediction</w:t>
       </w:r>
     </w:p>
     <w:p>
@@ -68,7 +80,35 @@
         <w:rPr>
           <w:color w:val="595959"/>
         </w:rPr>
-        <w:t>The objective is to predict Item_Outlet_Sales — the sales of 1,559 products across 10 BigMart outlets using 2013 transactional data. The dataset has 8,523 training rows and 5,681 test rows, with no target provided for test. The metric is RMSE on raw sales.</w:t>
+        <w:t xml:space="preserve">The objective is to predict </w:t>
+      </w:r>
+      <w:proofErr w:type="spellStart"/>
+      <w:r>
+        <w:rPr>
+          <w:color w:val="595959"/>
+        </w:rPr>
+        <w:t>Item_Outlet_Sales</w:t>
+      </w:r>
+      <w:proofErr w:type="spellEnd"/>
+      <w:r>
+        <w:rPr>
+          <w:color w:val="595959"/>
+        </w:rPr>
+        <w:t xml:space="preserve"> — the sales of 1,559 products across 10 </w:t>
+      </w:r>
+      <w:proofErr w:type="spellStart"/>
+      <w:r>
+        <w:rPr>
+          <w:color w:val="595959"/>
+        </w:rPr>
+        <w:t>BigMart</w:t>
+      </w:r>
+      <w:proofErr w:type="spellEnd"/>
+      <w:r>
+        <w:rPr>
+          <w:color w:val="595959"/>
+        </w:rPr>
+        <w:t xml:space="preserve"> outlets using 2013 transactional data. The dataset has 8,523 training rows and 5,681 test rows, with no target provided for test. The metric is RMSE on raw sales.</w:t>
       </w:r>
     </w:p>
     <w:p>
@@ -172,11 +212,33 @@
         </w:numPr>
         <w:spacing w:line="260" w:lineRule="auto"/>
       </w:pPr>
-      <w:r>
-        <w:rPr>
-          <w:color w:val="595959"/>
-        </w:rPr>
-        <w:t>Item_Weight: 1,463 missing values (~17%). Imputed using per-item mean across combined train+test — justified because the same product appears across outlets and its weight is fixed.</w:t>
+      <w:proofErr w:type="spellStart"/>
+      <w:r>
+        <w:rPr>
+          <w:color w:val="595959"/>
+        </w:rPr>
+        <w:t>Item_Weight</w:t>
+      </w:r>
+      <w:proofErr w:type="spellEnd"/>
+      <w:r>
+        <w:rPr>
+          <w:color w:val="595959"/>
+        </w:rPr>
+        <w:t xml:space="preserve">: 1,463 missing values (~17%). Imputed using per-item mean across combined </w:t>
+      </w:r>
+      <w:proofErr w:type="spellStart"/>
+      <w:r>
+        <w:rPr>
+          <w:color w:val="595959"/>
+        </w:rPr>
+        <w:t>train+test</w:t>
+      </w:r>
+      <w:proofErr w:type="spellEnd"/>
+      <w:r>
+        <w:rPr>
+          <w:color w:val="595959"/>
+        </w:rPr>
+        <w:t xml:space="preserve"> — justified because the same product appears across outlets and its weight is fixed.</w:t>
       </w:r>
     </w:p>
     <w:p>
@@ -188,11 +250,19 @@
         </w:numPr>
         <w:spacing w:line="260" w:lineRule="auto"/>
       </w:pPr>
-      <w:r>
-        <w:rPr>
-          <w:color w:val="595959"/>
-        </w:rPr>
-        <w:t>Item_Visibility: 526 rows with exactly zero visibility — a known data-entry error. Fixed using per-item mean visibility (non-zero rows only).</w:t>
+      <w:proofErr w:type="spellStart"/>
+      <w:r>
+        <w:rPr>
+          <w:color w:val="595959"/>
+        </w:rPr>
+        <w:t>Item_Visibility</w:t>
+      </w:r>
+      <w:proofErr w:type="spellEnd"/>
+      <w:r>
+        <w:rPr>
+          <w:color w:val="595959"/>
+        </w:rPr>
+        <w:t>: 526 rows with exactly zero visibility — a known data-entry error. Fixed using per-item mean visibility (non-zero rows only).</w:t>
       </w:r>
     </w:p>
     <w:p>
@@ -204,11 +274,33 @@
         </w:numPr>
         <w:spacing w:line="260" w:lineRule="auto"/>
       </w:pPr>
-      <w:r>
-        <w:rPr>
-          <w:color w:val="595959"/>
-        </w:rPr>
-        <w:t>Outlet_Size: 2,410 missing values (~28%). Imputed using per-Outlet_Type mode — logical since store size is a property of the outlet type.</w:t>
+      <w:proofErr w:type="spellStart"/>
+      <w:r>
+        <w:rPr>
+          <w:color w:val="595959"/>
+        </w:rPr>
+        <w:t>Outlet_Size</w:t>
+      </w:r>
+      <w:proofErr w:type="spellEnd"/>
+      <w:r>
+        <w:rPr>
+          <w:color w:val="595959"/>
+        </w:rPr>
+        <w:t>: 2,410 missing values (~28%). Imputed using per-</w:t>
+      </w:r>
+      <w:proofErr w:type="spellStart"/>
+      <w:r>
+        <w:rPr>
+          <w:color w:val="595959"/>
+        </w:rPr>
+        <w:t>Outlet_Type</w:t>
+      </w:r>
+      <w:proofErr w:type="spellEnd"/>
+      <w:r>
+        <w:rPr>
+          <w:color w:val="595959"/>
+        </w:rPr>
+        <w:t xml:space="preserve"> mode — logical since store size is a property of the outlet type.</w:t>
       </w:r>
     </w:p>
     <w:p>
@@ -220,11 +312,47 @@
         </w:numPr>
         <w:spacing w:line="260" w:lineRule="auto"/>
       </w:pPr>
-      <w:r>
-        <w:rPr>
-          <w:color w:val="595959"/>
-        </w:rPr>
-        <w:t>Item_Fat_Content: 5 inconsistent categories (Low Fat, LF, low fat, Regular, reg) normalised to 2 canonical values. Non-Consumable items relabelled as Non-Edible.</w:t>
+      <w:proofErr w:type="spellStart"/>
+      <w:r>
+        <w:rPr>
+          <w:color w:val="595959"/>
+        </w:rPr>
+        <w:t>Item_Fat_Content</w:t>
+      </w:r>
+      <w:proofErr w:type="spellEnd"/>
+      <w:r>
+        <w:rPr>
+          <w:color w:val="595959"/>
+        </w:rPr>
+        <w:t xml:space="preserve">: 5 inconsistent categories (Low Fat, LF, low fat, Regular, reg) </w:t>
+      </w:r>
+      <w:proofErr w:type="spellStart"/>
+      <w:r>
+        <w:rPr>
+          <w:color w:val="595959"/>
+        </w:rPr>
+        <w:t>normalised</w:t>
+      </w:r>
+      <w:proofErr w:type="spellEnd"/>
+      <w:r>
+        <w:rPr>
+          <w:color w:val="595959"/>
+        </w:rPr>
+        <w:t xml:space="preserve"> to 2 canonical values. Non-Consumable items </w:t>
+      </w:r>
+      <w:proofErr w:type="spellStart"/>
+      <w:r>
+        <w:rPr>
+          <w:color w:val="595959"/>
+        </w:rPr>
+        <w:t>relabelled</w:t>
+      </w:r>
+      <w:proofErr w:type="spellEnd"/>
+      <w:r>
+        <w:rPr>
+          <w:color w:val="595959"/>
+        </w:rPr>
+        <w:t xml:space="preserve"> as Non-Edible.</w:t>
       </w:r>
     </w:p>
     <w:p>
@@ -249,11 +377,19 @@
         </w:numPr>
         <w:spacing w:line="260" w:lineRule="auto"/>
       </w:pPr>
-      <w:r>
-        <w:rPr>
-          <w:color w:val="595959"/>
-        </w:rPr>
-        <w:t>Item_MRP is the strongest numeric predictor (Pearson r ≈ 0.57). Higher-priced items sell more.</w:t>
+      <w:proofErr w:type="spellStart"/>
+      <w:r>
+        <w:rPr>
+          <w:color w:val="595959"/>
+        </w:rPr>
+        <w:t>Item_MRP</w:t>
+      </w:r>
+      <w:proofErr w:type="spellEnd"/>
+      <w:r>
+        <w:rPr>
+          <w:color w:val="595959"/>
+        </w:rPr>
+        <w:t xml:space="preserve"> is the strongest numeric predictor (Pearson r ≈ 0.57). Higher-priced items sell more.</w:t>
       </w:r>
     </w:p>
     <w:p>
@@ -265,11 +401,33 @@
         </w:numPr>
         <w:spacing w:line="260" w:lineRule="auto"/>
       </w:pPr>
-      <w:r>
-        <w:rPr>
-          <w:color w:val="595959"/>
-        </w:rPr>
-        <w:t>Outlet_Type and Outlet_Identifier drive massive sales variance — Supermarket Type3 outsells Grocery Stores by 10×.</w:t>
+      <w:proofErr w:type="spellStart"/>
+      <w:r>
+        <w:rPr>
+          <w:color w:val="595959"/>
+        </w:rPr>
+        <w:t>Outlet_Type</w:t>
+      </w:r>
+      <w:proofErr w:type="spellEnd"/>
+      <w:r>
+        <w:rPr>
+          <w:color w:val="595959"/>
+        </w:rPr>
+        <w:t xml:space="preserve"> and </w:t>
+      </w:r>
+      <w:proofErr w:type="spellStart"/>
+      <w:r>
+        <w:rPr>
+          <w:color w:val="595959"/>
+        </w:rPr>
+        <w:t>Outlet_Identifier</w:t>
+      </w:r>
+      <w:proofErr w:type="spellEnd"/>
+      <w:r>
+        <w:rPr>
+          <w:color w:val="595959"/>
+        </w:rPr>
+        <w:t xml:space="preserve"> drive massive sales variance — Supermarket Type3 outsells Grocery Stores by 10×.</w:t>
       </w:r>
     </w:p>
     <w:p>
@@ -281,11 +439,33 @@
         </w:numPr>
         <w:spacing w:line="260" w:lineRule="auto"/>
       </w:pPr>
-      <w:r>
-        <w:rPr>
-          <w:color w:val="595959"/>
-        </w:rPr>
-        <w:t>Item_Visibility is right-skewed; log1p transformation normalises it.</w:t>
+      <w:proofErr w:type="spellStart"/>
+      <w:r>
+        <w:rPr>
+          <w:color w:val="595959"/>
+        </w:rPr>
+        <w:t>Item_Visibility</w:t>
+      </w:r>
+      <w:proofErr w:type="spellEnd"/>
+      <w:r>
+        <w:rPr>
+          <w:color w:val="595959"/>
+        </w:rPr>
+        <w:t xml:space="preserve"> is right-skewed; log1p transformation </w:t>
+      </w:r>
+      <w:proofErr w:type="spellStart"/>
+      <w:r>
+        <w:rPr>
+          <w:color w:val="595959"/>
+        </w:rPr>
+        <w:t>normalises</w:t>
+      </w:r>
+      <w:proofErr w:type="spellEnd"/>
+      <w:r>
+        <w:rPr>
+          <w:color w:val="595959"/>
+        </w:rPr>
+        <w:t xml:space="preserve"> it.</w:t>
       </w:r>
     </w:p>
     <w:p>
@@ -297,11 +477,19 @@
         </w:numPr>
         <w:spacing w:line="260" w:lineRule="auto"/>
       </w:pPr>
-      <w:r>
-        <w:rPr>
-          <w:color w:val="595959"/>
-        </w:rPr>
-        <w:t>Item_Identifier prefix (FD / DR / NC) encodes food, drink, and non-consumable categories with distinct sales profiles.</w:t>
+      <w:proofErr w:type="spellStart"/>
+      <w:r>
+        <w:rPr>
+          <w:color w:val="595959"/>
+        </w:rPr>
+        <w:t>Item_Identifier</w:t>
+      </w:r>
+      <w:proofErr w:type="spellEnd"/>
+      <w:r>
+        <w:rPr>
+          <w:color w:val="595959"/>
+        </w:rPr>
+        <w:t xml:space="preserve"> prefix (FD / DR / NC) encodes food, drink, and non-consumable categories with distinct sales profiles.</w:t>
       </w:r>
     </w:p>
     <w:p>
@@ -359,12 +547,6 @@
         <w:gridCol w:w="6560"/>
       </w:tblGrid>
       <w:tr>
-        <w:tblPrEx>
-          <w:tblCellMar>
-            <w:top w:w="0" w:type="dxa"/>
-            <w:bottom w:w="0" w:type="dxa"/>
-          </w:tblCellMar>
-        </w:tblPrEx>
         <w:trPr>
           <w:tblHeader/>
         </w:trPr>
@@ -431,12 +613,6 @@
         </w:tc>
       </w:tr>
       <w:tr>
-        <w:tblPrEx>
-          <w:tblCellMar>
-            <w:top w:w="0" w:type="dxa"/>
-            <w:bottom w:w="0" w:type="dxa"/>
-          </w:tblCellMar>
-        </w:tblPrEx>
         <w:tc>
           <w:tcPr>
             <w:tcW w:w="2800" w:type="dxa"/>
@@ -455,6 +631,7 @@
             </w:tcMar>
           </w:tcPr>
           <w:p>
+            <w:proofErr w:type="spellStart"/>
             <w:r>
               <w:rPr>
                 <w:color w:val="333333"/>
@@ -463,6 +640,7 @@
               </w:rPr>
               <w:t>Outlet_Age</w:t>
             </w:r>
+            <w:proofErr w:type="spellEnd"/>
           </w:p>
         </w:tc>
         <w:tc>
@@ -495,12 +673,6 @@
         </w:tc>
       </w:tr>
       <w:tr>
-        <w:tblPrEx>
-          <w:tblCellMar>
-            <w:top w:w="0" w:type="dxa"/>
-            <w:bottom w:w="0" w:type="dxa"/>
-          </w:tblCellMar>
-        </w:tblPrEx>
         <w:tc>
           <w:tcPr>
             <w:tcW w:w="2800" w:type="dxa"/>
@@ -519,6 +691,7 @@
             </w:tcMar>
           </w:tcPr>
           <w:p>
+            <w:proofErr w:type="spellStart"/>
             <w:r>
               <w:rPr>
                 <w:color w:val="333333"/>
@@ -527,6 +700,7 @@
               </w:rPr>
               <w:t>Log_Item_Visibility</w:t>
             </w:r>
+            <w:proofErr w:type="spellEnd"/>
           </w:p>
         </w:tc>
         <w:tc>
@@ -559,12 +733,6 @@
         </w:tc>
       </w:tr>
       <w:tr>
-        <w:tblPrEx>
-          <w:tblCellMar>
-            <w:top w:w="0" w:type="dxa"/>
-            <w:bottom w:w="0" w:type="dxa"/>
-          </w:tblCellMar>
-        </w:tblPrEx>
         <w:tc>
           <w:tcPr>
             <w:tcW w:w="2800" w:type="dxa"/>
@@ -583,6 +751,7 @@
             </w:tcMar>
           </w:tcPr>
           <w:p>
+            <w:proofErr w:type="spellStart"/>
             <w:r>
               <w:rPr>
                 <w:color w:val="333333"/>
@@ -591,6 +760,7 @@
               </w:rPr>
               <w:t>Item_Visibility_MeanRatio</w:t>
             </w:r>
+            <w:proofErr w:type="spellEnd"/>
           </w:p>
         </w:tc>
         <w:tc>
@@ -623,12 +793,6 @@
         </w:tc>
       </w:tr>
       <w:tr>
-        <w:tblPrEx>
-          <w:tblCellMar>
-            <w:top w:w="0" w:type="dxa"/>
-            <w:bottom w:w="0" w:type="dxa"/>
-          </w:tblCellMar>
-        </w:tblPrEx>
         <w:tc>
           <w:tcPr>
             <w:tcW w:w="2800" w:type="dxa"/>
@@ -647,6 +811,7 @@
             </w:tcMar>
           </w:tcPr>
           <w:p>
+            <w:proofErr w:type="spellStart"/>
             <w:r>
               <w:rPr>
                 <w:color w:val="333333"/>
@@ -655,6 +820,7 @@
               </w:rPr>
               <w:t>MRP_Per_Category</w:t>
             </w:r>
+            <w:proofErr w:type="spellEnd"/>
           </w:p>
         </w:tc>
         <w:tc>
@@ -687,12 +853,6 @@
         </w:tc>
       </w:tr>
       <w:tr>
-        <w:tblPrEx>
-          <w:tblCellMar>
-            <w:top w:w="0" w:type="dxa"/>
-            <w:bottom w:w="0" w:type="dxa"/>
-          </w:tblCellMar>
-        </w:tblPrEx>
         <w:tc>
           <w:tcPr>
             <w:tcW w:w="2800" w:type="dxa"/>
@@ -711,6 +871,7 @@
             </w:tcMar>
           </w:tcPr>
           <w:p>
+            <w:proofErr w:type="spellStart"/>
             <w:r>
               <w:rPr>
                 <w:color w:val="333333"/>
@@ -719,6 +880,7 @@
               </w:rPr>
               <w:t>MRP_x_OutletType</w:t>
             </w:r>
+            <w:proofErr w:type="spellEnd"/>
           </w:p>
         </w:tc>
         <w:tc>
@@ -751,12 +913,6 @@
         </w:tc>
       </w:tr>
       <w:tr>
-        <w:tblPrEx>
-          <w:tblCellMar>
-            <w:top w:w="0" w:type="dxa"/>
-            <w:bottom w:w="0" w:type="dxa"/>
-          </w:tblCellMar>
-        </w:tblPrEx>
         <w:tc>
           <w:tcPr>
             <w:tcW w:w="2800" w:type="dxa"/>
@@ -775,13 +931,23 @@
             </w:tcMar>
           </w:tcPr>
           <w:p>
-            <w:r>
-              <w:rPr>
-                <w:color w:val="333333"/>
-                <w:sz w:val="18"/>
-                <w:szCs w:val="18"/>
-              </w:rPr>
-              <w:t>MRP_Bin (16 bins)</w:t>
+            <w:proofErr w:type="spellStart"/>
+            <w:r>
+              <w:rPr>
+                <w:color w:val="333333"/>
+                <w:sz w:val="18"/>
+                <w:szCs w:val="18"/>
+              </w:rPr>
+              <w:t>MRP_Bin</w:t>
+            </w:r>
+            <w:proofErr w:type="spellEnd"/>
+            <w:r>
+              <w:rPr>
+                <w:color w:val="333333"/>
+                <w:sz w:val="18"/>
+                <w:szCs w:val="18"/>
+              </w:rPr>
+              <w:t xml:space="preserve"> (16 bins)</w:t>
             </w:r>
           </w:p>
         </w:tc>
@@ -815,12 +981,6 @@
         </w:tc>
       </w:tr>
       <w:tr>
-        <w:tblPrEx>
-          <w:tblCellMar>
-            <w:top w:w="0" w:type="dxa"/>
-            <w:bottom w:w="0" w:type="dxa"/>
-          </w:tblCellMar>
-        </w:tblPrEx>
         <w:tc>
           <w:tcPr>
             <w:tcW w:w="2800" w:type="dxa"/>
@@ -839,6 +999,7 @@
             </w:tcMar>
           </w:tcPr>
           <w:p>
+            <w:proofErr w:type="spellStart"/>
             <w:r>
               <w:rPr>
                 <w:color w:val="333333"/>
@@ -847,6 +1008,7 @@
               </w:rPr>
               <w:t>Item_Cat_x_Outlet</w:t>
             </w:r>
+            <w:proofErr w:type="spellEnd"/>
           </w:p>
         </w:tc>
         <w:tc>
@@ -879,12 +1041,6 @@
         </w:tc>
       </w:tr>
       <w:tr>
-        <w:tblPrEx>
-          <w:tblCellMar>
-            <w:top w:w="0" w:type="dxa"/>
-            <w:bottom w:w="0" w:type="dxa"/>
-          </w:tblCellMar>
-        </w:tblPrEx>
         <w:tc>
           <w:tcPr>
             <w:tcW w:w="2800" w:type="dxa"/>
@@ -903,6 +1059,7 @@
             </w:tcMar>
           </w:tcPr>
           <w:p>
+            <w:proofErr w:type="spellStart"/>
             <w:r>
               <w:rPr>
                 <w:color w:val="333333"/>
@@ -911,6 +1068,7 @@
               </w:rPr>
               <w:t>Is_Grocery</w:t>
             </w:r>
+            <w:proofErr w:type="spellEnd"/>
           </w:p>
         </w:tc>
         <w:tc>
@@ -953,7 +1111,15 @@
         <w:pStyle w:val="Heading2"/>
       </w:pPr>
       <w:r>
-        <w:t>3.1  KFold Target Encoding</w:t>
+        <w:t xml:space="preserve">3.1  </w:t>
+      </w:r>
+      <w:proofErr w:type="spellStart"/>
+      <w:r>
+        <w:t>KFold</w:t>
+      </w:r>
+      <w:proofErr w:type="spellEnd"/>
+      <w:r>
+        <w:t xml:space="preserve"> Target Encoding</w:t>
       </w:r>
     </w:p>
     <w:p>
@@ -965,7 +1131,77 @@
         <w:rPr>
           <w:color w:val="595959"/>
         </w:rPr>
-        <w:t>Five high-cardinality columns — Item_Identifier (1,559 unique), Outlet_Identifier (10), Item_Type (16), Item_Category, and Item_Cat_x_Outlet — were mean-encoded using 5-fold out-of-fold encoding with Laplace smoothing (α=10). This is the single highest-impact feature transformation: it encodes historical sales signal directly into numeric features without any leakage, replacing naive label encoding which discards ordinal sales information entirely.</w:t>
+        <w:t xml:space="preserve">Five high-cardinality columns — </w:t>
+      </w:r>
+      <w:proofErr w:type="spellStart"/>
+      <w:r>
+        <w:rPr>
+          <w:color w:val="595959"/>
+        </w:rPr>
+        <w:t>Item_Identifier</w:t>
+      </w:r>
+      <w:proofErr w:type="spellEnd"/>
+      <w:r>
+        <w:rPr>
+          <w:color w:val="595959"/>
+        </w:rPr>
+        <w:t xml:space="preserve"> (1,559 unique), </w:t>
+      </w:r>
+      <w:proofErr w:type="spellStart"/>
+      <w:r>
+        <w:rPr>
+          <w:color w:val="595959"/>
+        </w:rPr>
+        <w:t>Outlet_Identifier</w:t>
+      </w:r>
+      <w:proofErr w:type="spellEnd"/>
+      <w:r>
+        <w:rPr>
+          <w:color w:val="595959"/>
+        </w:rPr>
+        <w:t xml:space="preserve"> (10), </w:t>
+      </w:r>
+      <w:proofErr w:type="spellStart"/>
+      <w:r>
+        <w:rPr>
+          <w:color w:val="595959"/>
+        </w:rPr>
+        <w:t>Item_Type</w:t>
+      </w:r>
+      <w:proofErr w:type="spellEnd"/>
+      <w:r>
+        <w:rPr>
+          <w:color w:val="595959"/>
+        </w:rPr>
+        <w:t xml:space="preserve"> (16), </w:t>
+      </w:r>
+      <w:proofErr w:type="spellStart"/>
+      <w:r>
+        <w:rPr>
+          <w:color w:val="595959"/>
+        </w:rPr>
+        <w:t>Item_Category</w:t>
+      </w:r>
+      <w:proofErr w:type="spellEnd"/>
+      <w:r>
+        <w:rPr>
+          <w:color w:val="595959"/>
+        </w:rPr>
+        <w:t xml:space="preserve">, and </w:t>
+      </w:r>
+      <w:proofErr w:type="spellStart"/>
+      <w:r>
+        <w:rPr>
+          <w:color w:val="595959"/>
+        </w:rPr>
+        <w:t>Item_Cat_x_Outlet</w:t>
+      </w:r>
+      <w:proofErr w:type="spellEnd"/>
+      <w:r>
+        <w:rPr>
+          <w:color w:val="595959"/>
+        </w:rPr>
+        <w:t xml:space="preserve"> — were mean-encoded using 5-fold out-of-fold encoding with Laplace smoothing (α=10). This is the single highest-impact feature transformation: it encodes historical sales signal directly into numeric features without any leakage, replacing naive label encoding which discards ordinal sales information entirely.</w:t>
       </w:r>
     </w:p>
     <w:p>
@@ -1014,8 +1250,21 @@
         <w:pStyle w:val="Heading2"/>
       </w:pPr>
       <w:r>
-        <w:t>4.2  Hyperparameter Optimisation via Optuna</w:t>
-      </w:r>
+        <w:t xml:space="preserve">4.2  Hyperparameter </w:t>
+      </w:r>
+      <w:proofErr w:type="spellStart"/>
+      <w:r>
+        <w:t>Optimisation</w:t>
+      </w:r>
+      <w:proofErr w:type="spellEnd"/>
+      <w:r>
+        <w:t xml:space="preserve"> via </w:t>
+      </w:r>
+      <w:proofErr w:type="spellStart"/>
+      <w:r>
+        <w:t>Optuna</w:t>
+      </w:r>
+      <w:proofErr w:type="spellEnd"/>
     </w:p>
     <w:p>
       <w:pPr>
@@ -1026,7 +1275,49 @@
         <w:rPr>
           <w:color w:val="595959"/>
         </w:rPr>
-        <w:t>Each model was tuned using Optuna with a TPE (Tree-structured Parzen Estimator) sampler and MedianPruner to kill underperforming trials early. Six independent studies were run — one per model type per split — totalling 480 trials. The objective in every study was 5-fold out-of-fold RMSE on the log-transformed target.</w:t>
+        <w:t xml:space="preserve">Each model was tuned using </w:t>
+      </w:r>
+      <w:proofErr w:type="spellStart"/>
+      <w:r>
+        <w:rPr>
+          <w:color w:val="595959"/>
+        </w:rPr>
+        <w:t>Optuna</w:t>
+      </w:r>
+      <w:proofErr w:type="spellEnd"/>
+      <w:r>
+        <w:rPr>
+          <w:color w:val="595959"/>
+        </w:rPr>
+        <w:t xml:space="preserve"> with a TPE (Tree-structured Parzen Estimator) sampler and </w:t>
+      </w:r>
+      <w:proofErr w:type="spellStart"/>
+      <w:r>
+        <w:rPr>
+          <w:color w:val="595959"/>
+        </w:rPr>
+        <w:t>MedianPruner</w:t>
+      </w:r>
+      <w:proofErr w:type="spellEnd"/>
+      <w:r>
+        <w:rPr>
+          <w:color w:val="595959"/>
+        </w:rPr>
+        <w:t xml:space="preserve"> to kill underperforming trials early. Six independent studies were run — one per model type per split — </w:t>
+      </w:r>
+      <w:proofErr w:type="spellStart"/>
+      <w:r>
+        <w:rPr>
+          <w:color w:val="595959"/>
+        </w:rPr>
+        <w:t>totalling</w:t>
+      </w:r>
+      <w:proofErr w:type="spellEnd"/>
+      <w:r>
+        <w:rPr>
+          <w:color w:val="595959"/>
+        </w:rPr>
+        <w:t xml:space="preserve"> 480 trials. The objective in every study was 5-fold out-of-fold RMSE on the log-transformed target.</w:t>
       </w:r>
     </w:p>
     <w:p>
@@ -1047,11 +1338,47 @@
         <w:spacing w:before="60" w:after="60" w:line="276" w:lineRule="auto"/>
         <w:jc w:val="both"/>
       </w:pPr>
-      <w:r>
-        <w:rPr>
-          <w:color w:val="595959"/>
-        </w:rPr>
-        <w:t>XGBoost, LightGBM, and CatBoost were each benchmarked independently (notebooks 05–07) before combining, to understand individual model ceilings and identify which learner dominates on each split.</w:t>
+      <w:proofErr w:type="spellStart"/>
+      <w:r>
+        <w:rPr>
+          <w:color w:val="595959"/>
+        </w:rPr>
+        <w:t>XGBoost</w:t>
+      </w:r>
+      <w:proofErr w:type="spellEnd"/>
+      <w:r>
+        <w:rPr>
+          <w:color w:val="595959"/>
+        </w:rPr>
+        <w:t xml:space="preserve">, </w:t>
+      </w:r>
+      <w:proofErr w:type="spellStart"/>
+      <w:r>
+        <w:rPr>
+          <w:color w:val="595959"/>
+        </w:rPr>
+        <w:t>LightGBM</w:t>
+      </w:r>
+      <w:proofErr w:type="spellEnd"/>
+      <w:r>
+        <w:rPr>
+          <w:color w:val="595959"/>
+        </w:rPr>
+        <w:t xml:space="preserve">, and </w:t>
+      </w:r>
+      <w:proofErr w:type="spellStart"/>
+      <w:r>
+        <w:rPr>
+          <w:color w:val="595959"/>
+        </w:rPr>
+        <w:t>CatBoost</w:t>
+      </w:r>
+      <w:proofErr w:type="spellEnd"/>
+      <w:r>
+        <w:rPr>
+          <w:color w:val="595959"/>
+        </w:rPr>
+        <w:t xml:space="preserve"> were each benchmarked independently (notebooks 05–07) before combining, to understand individual model ceilings and identify which learner dominates on each split.</w:t>
       </w:r>
     </w:p>
     <w:p>
@@ -1076,7 +1403,105 @@
         <w:rPr>
           <w:color w:val="595959"/>
         </w:rPr>
-        <w:t>The final architecture (notebook 04) stacks all three base learners. Out-of-fold predictions from XGBoost, LightGBM, and CatBoost feed a BayesianRidge meta-learner. Critically, the three OOF columns are passed through a StandardScaler before the meta-learner — tree models don't need scaling, but BayesianRidge as a linear model benefits from normalised inputs. The ensemble is trained and evaluated independently per split.</w:t>
+        <w:t xml:space="preserve">The final architecture (notebook 04) stacks all three base learners. Out-of-fold predictions from </w:t>
+      </w:r>
+      <w:proofErr w:type="spellStart"/>
+      <w:r>
+        <w:rPr>
+          <w:color w:val="595959"/>
+        </w:rPr>
+        <w:t>XGBoost</w:t>
+      </w:r>
+      <w:proofErr w:type="spellEnd"/>
+      <w:r>
+        <w:rPr>
+          <w:color w:val="595959"/>
+        </w:rPr>
+        <w:t xml:space="preserve">, </w:t>
+      </w:r>
+      <w:proofErr w:type="spellStart"/>
+      <w:r>
+        <w:rPr>
+          <w:color w:val="595959"/>
+        </w:rPr>
+        <w:t>LightGBM</w:t>
+      </w:r>
+      <w:proofErr w:type="spellEnd"/>
+      <w:r>
+        <w:rPr>
+          <w:color w:val="595959"/>
+        </w:rPr>
+        <w:t xml:space="preserve">, and </w:t>
+      </w:r>
+      <w:proofErr w:type="spellStart"/>
+      <w:r>
+        <w:rPr>
+          <w:color w:val="595959"/>
+        </w:rPr>
+        <w:t>CatBoost</w:t>
+      </w:r>
+      <w:proofErr w:type="spellEnd"/>
+      <w:r>
+        <w:rPr>
+          <w:color w:val="595959"/>
+        </w:rPr>
+        <w:t xml:space="preserve"> feed a </w:t>
+      </w:r>
+      <w:proofErr w:type="spellStart"/>
+      <w:r>
+        <w:rPr>
+          <w:color w:val="595959"/>
+        </w:rPr>
+        <w:t>BayesianRidge</w:t>
+      </w:r>
+      <w:proofErr w:type="spellEnd"/>
+      <w:r>
+        <w:rPr>
+          <w:color w:val="595959"/>
+        </w:rPr>
+        <w:t xml:space="preserve"> meta-learner. Critically, the three OOF columns are passed through a </w:t>
+      </w:r>
+      <w:proofErr w:type="spellStart"/>
+      <w:r>
+        <w:rPr>
+          <w:color w:val="595959"/>
+        </w:rPr>
+        <w:t>StandardScaler</w:t>
+      </w:r>
+      <w:proofErr w:type="spellEnd"/>
+      <w:r>
+        <w:rPr>
+          <w:color w:val="595959"/>
+        </w:rPr>
+        <w:t xml:space="preserve"> before the meta-learner — tree models don't need scaling, but </w:t>
+      </w:r>
+      <w:proofErr w:type="spellStart"/>
+      <w:r>
+        <w:rPr>
+          <w:color w:val="595959"/>
+        </w:rPr>
+        <w:t>BayesianRidge</w:t>
+      </w:r>
+      <w:proofErr w:type="spellEnd"/>
+      <w:r>
+        <w:rPr>
+          <w:color w:val="595959"/>
+        </w:rPr>
+        <w:t xml:space="preserve"> as a linear model benefits from </w:t>
+      </w:r>
+      <w:proofErr w:type="spellStart"/>
+      <w:r>
+        <w:rPr>
+          <w:color w:val="595959"/>
+        </w:rPr>
+        <w:t>normalised</w:t>
+      </w:r>
+      <w:proofErr w:type="spellEnd"/>
+      <w:r>
+        <w:rPr>
+          <w:color w:val="595959"/>
+        </w:rPr>
+        <w:t xml:space="preserve"> inputs. The ensemble is trained and evaluated independently per split.</w:t>
       </w:r>
     </w:p>
     <w:p>
@@ -1093,7 +1518,15 @@
       </w:pPr>
       <w:r>
         <w:lastRenderedPageBreak/>
-        <w:t>5. Evaluation, Normalisation &amp; Feature Pruning</w:t>
+        <w:t xml:space="preserve">5. Evaluation, </w:t>
+      </w:r>
+      <w:proofErr w:type="spellStart"/>
+      <w:r>
+        <w:t>Normalisation</w:t>
+      </w:r>
+      <w:proofErr w:type="spellEnd"/>
+      <w:r>
+        <w:t xml:space="preserve"> &amp; Feature Pruning</w:t>
       </w:r>
     </w:p>
     <w:p>
@@ -1113,7 +1546,35 @@
         <w:rPr>
           <w:color w:val="595959"/>
         </w:rPr>
-        <w:t>With only ~22 features, pre-hoc correlation filtering was deliberately avoided. Tree models handle correlated features natively — they simply select the more informative one at each split. Removing correlated features before training risks discarding complementary signal (e.g. Item_MRP and TE_Item_Identifier are correlated but each carries unique variance). Permutation importance post-training is a safer, model-aware alternative.</w:t>
+        <w:t xml:space="preserve">With only ~22 features, pre-hoc correlation filtering was deliberately avoided. Tree models handle correlated features natively — they simply select the more informative one at each split. Removing correlated features before training risks discarding complementary signal (e.g. </w:t>
+      </w:r>
+      <w:proofErr w:type="spellStart"/>
+      <w:r>
+        <w:rPr>
+          <w:color w:val="595959"/>
+        </w:rPr>
+        <w:t>Item_MRP</w:t>
+      </w:r>
+      <w:proofErr w:type="spellEnd"/>
+      <w:r>
+        <w:rPr>
+          <w:color w:val="595959"/>
+        </w:rPr>
+        <w:t xml:space="preserve"> and </w:t>
+      </w:r>
+      <w:proofErr w:type="spellStart"/>
+      <w:r>
+        <w:rPr>
+          <w:color w:val="595959"/>
+        </w:rPr>
+        <w:t>TE_Item_Identifier</w:t>
+      </w:r>
+      <w:proofErr w:type="spellEnd"/>
+      <w:r>
+        <w:rPr>
+          <w:color w:val="595959"/>
+        </w:rPr>
+        <w:t xml:space="preserve"> are correlated but each carries unique variance). Permutation importance post-training is a safer, model-aware alternative.</w:t>
       </w:r>
     </w:p>
     <w:p>
@@ -1138,7 +1599,21 @@
         <w:rPr>
           <w:color w:val="595959"/>
         </w:rPr>
-        <w:t>After final model fitting, permutation importance (20 repeats, sklearn.inspection) was computed per split. Features where shuffling causes no RMSE degradation are flagged red in the output charts. A consensus drop list identifies features useless in both splits simultaneously — a tighter criterion than single-split analysis. This avoids the false positives endemic to split-gain importance, which over-rates high-cardinality columns.</w:t>
+        <w:t xml:space="preserve">After final model fitting, permutation importance (20 repeats, </w:t>
+      </w:r>
+      <w:proofErr w:type="spellStart"/>
+      <w:r>
+        <w:rPr>
+          <w:color w:val="595959"/>
+        </w:rPr>
+        <w:t>sklearn.inspection</w:t>
+      </w:r>
+      <w:proofErr w:type="spellEnd"/>
+      <w:r>
+        <w:rPr>
+          <w:color w:val="595959"/>
+        </w:rPr>
+        <w:t>) was computed per split. Features where shuffling causes no RMSE degradation are flagged red in the output charts. A consensus drop list identifies features useless in both splits simultaneously — a tighter criterion than single-split analysis. This avoids the false positives endemic to split-gain importance, which over-rates high-cardinality columns.</w:t>
       </w:r>
     </w:p>
     <w:p>
@@ -1151,7 +1626,15 @@
         <w:pStyle w:val="Heading2"/>
       </w:pPr>
       <w:r>
-        <w:t>5.3  Normalisation Scope</w:t>
+        <w:t xml:space="preserve">5.3  </w:t>
+      </w:r>
+      <w:proofErr w:type="spellStart"/>
+      <w:r>
+        <w:t>Normalisation</w:t>
+      </w:r>
+      <w:proofErr w:type="spellEnd"/>
+      <w:r>
+        <w:t xml:space="preserve"> Scope</w:t>
       </w:r>
     </w:p>
     <w:p>
@@ -1159,11 +1642,61 @@
         <w:spacing w:before="60" w:after="60" w:line="276" w:lineRule="auto"/>
         <w:jc w:val="both"/>
       </w:pPr>
-      <w:r>
-        <w:rPr>
-          <w:color w:val="595959"/>
-        </w:rPr>
-        <w:t>StandardScaler is applied exclusively to the 3 meta-learner inputs (XGB/LGB/CatBoost OOF predictions). Tree base models receive raw features — scaling has zero effect on split-based learners. The log1p target transformation serves as implicit output normalisation, stabilising variance and pulling the right tail of the sales distribution closer to Gaussian.</w:t>
+      <w:proofErr w:type="spellStart"/>
+      <w:r>
+        <w:rPr>
+          <w:color w:val="595959"/>
+        </w:rPr>
+        <w:t>StandardScaler</w:t>
+      </w:r>
+      <w:proofErr w:type="spellEnd"/>
+      <w:r>
+        <w:rPr>
+          <w:color w:val="595959"/>
+        </w:rPr>
+        <w:t xml:space="preserve"> is applied exclusively to the 3 meta-learner inputs (XGB/LGB/</w:t>
+      </w:r>
+      <w:proofErr w:type="spellStart"/>
+      <w:r>
+        <w:rPr>
+          <w:color w:val="595959"/>
+        </w:rPr>
+        <w:t>CatBoost</w:t>
+      </w:r>
+      <w:proofErr w:type="spellEnd"/>
+      <w:r>
+        <w:rPr>
+          <w:color w:val="595959"/>
+        </w:rPr>
+        <w:t xml:space="preserve"> OOF predictions). Tree base models receive raw features — scaling has zero effect on split-based learners. The log1p target transformation serves as implicit output </w:t>
+      </w:r>
+      <w:proofErr w:type="spellStart"/>
+      <w:r>
+        <w:rPr>
+          <w:color w:val="595959"/>
+        </w:rPr>
+        <w:t>normalisation</w:t>
+      </w:r>
+      <w:proofErr w:type="spellEnd"/>
+      <w:r>
+        <w:rPr>
+          <w:color w:val="595959"/>
+        </w:rPr>
+        <w:t xml:space="preserve">, </w:t>
+      </w:r>
+      <w:proofErr w:type="spellStart"/>
+      <w:r>
+        <w:rPr>
+          <w:color w:val="595959"/>
+        </w:rPr>
+        <w:t>stabilising</w:t>
+      </w:r>
+      <w:proofErr w:type="spellEnd"/>
+      <w:r>
+        <w:rPr>
+          <w:color w:val="595959"/>
+        </w:rPr>
+        <w:t xml:space="preserve"> variance and pulling the right tail of the sales distribution closer to Gaussian.</w:t>
       </w:r>
     </w:p>
     <w:p>
@@ -1184,7 +1717,7 @@
     </w:p>
     <w:tbl>
       <w:tblPr>
-        <w:tblW w:w="9360" w:type="dxa"/>
+        <w:tblW w:w="9809" w:type="dxa"/>
         <w:tblBorders>
           <w:top w:val="single" w:sz="4" w:space="0" w:color="auto"/>
           <w:left w:val="single" w:sz="4" w:space="0" w:color="auto"/>
@@ -1202,15 +1735,9 @@
       <w:tblGrid>
         <w:gridCol w:w="4319"/>
         <w:gridCol w:w="3060"/>
-        <w:gridCol w:w="1981"/>
+        <w:gridCol w:w="2430"/>
       </w:tblGrid>
       <w:tr>
-        <w:tblPrEx>
-          <w:tblCellMar>
-            <w:top w:w="0" w:type="dxa"/>
-            <w:bottom w:w="0" w:type="dxa"/>
-          </w:tblCellMar>
-        </w:tblPrEx>
         <w:trPr>
           <w:tblHeader/>
         </w:trPr>
@@ -1276,7 +1803,7 @@
         </w:tc>
         <w:tc>
           <w:tcPr>
-            <w:tcW w:w="1981" w:type="dxa"/>
+            <w:tcW w:w="2430" w:type="dxa"/>
             <w:tcBorders>
               <w:top w:val="single" w:sz="1" w:space="0" w:color="C0C0C0"/>
               <w:left w:val="single" w:sz="1" w:space="0" w:color="C0C0C0"/>
@@ -1306,12 +1833,6 @@
         </w:tc>
       </w:tr>
       <w:tr>
-        <w:tblPrEx>
-          <w:tblCellMar>
-            <w:top w:w="0" w:type="dxa"/>
-            <w:bottom w:w="0" w:type="dxa"/>
-          </w:tblCellMar>
-        </w:tblPrEx>
         <w:tc>
           <w:tcPr>
             <w:tcW w:w="4319" w:type="dxa"/>
@@ -1370,7 +1891,7 @@
         </w:tc>
         <w:tc>
           <w:tcPr>
-            <w:tcW w:w="1981" w:type="dxa"/>
+            <w:tcW w:w="2430" w:type="dxa"/>
             <w:tcBorders>
               <w:top w:val="single" w:sz="1" w:space="0" w:color="C0C0C0"/>
               <w:left w:val="single" w:sz="1" w:space="0" w:color="C0C0C0"/>
@@ -1396,12 +1917,6 @@
         </w:tc>
       </w:tr>
       <w:tr>
-        <w:tblPrEx>
-          <w:tblCellMar>
-            <w:top w:w="0" w:type="dxa"/>
-            <w:bottom w:w="0" w:type="dxa"/>
-          </w:tblCellMar>
-        </w:tblPrEx>
         <w:tc>
           <w:tcPr>
             <w:tcW w:w="4319" w:type="dxa"/>
@@ -1426,8 +1941,18 @@
                 <w:sz w:val="18"/>
                 <w:szCs w:val="18"/>
               </w:rPr>
-              <w:t>XGB + Optuna</w:t>
-            </w:r>
+              <w:t xml:space="preserve">XGB + </w:t>
+            </w:r>
+            <w:proofErr w:type="spellStart"/>
+            <w:r>
+              <w:rPr>
+                <w:color w:val="333333"/>
+                <w:sz w:val="18"/>
+                <w:szCs w:val="18"/>
+              </w:rPr>
+              <w:t>Optuna</w:t>
+            </w:r>
+            <w:proofErr w:type="spellEnd"/>
             <w:r>
               <w:rPr>
                 <w:color w:val="333333"/>
@@ -1468,7 +1993,7 @@
         </w:tc>
         <w:tc>
           <w:tcPr>
-            <w:tcW w:w="1981" w:type="dxa"/>
+            <w:tcW w:w="2430" w:type="dxa"/>
             <w:tcBorders>
               <w:top w:val="single" w:sz="1" w:space="0" w:color="C0C0C0"/>
               <w:left w:val="single" w:sz="1" w:space="0" w:color="C0C0C0"/>
@@ -1491,12 +2016,6 @@
         </w:tc>
       </w:tr>
       <w:tr>
-        <w:tblPrEx>
-          <w:tblCellMar>
-            <w:top w:w="0" w:type="dxa"/>
-            <w:bottom w:w="0" w:type="dxa"/>
-          </w:tblCellMar>
-        </w:tblPrEx>
         <w:tc>
           <w:tcPr>
             <w:tcW w:w="4319" w:type="dxa"/>
@@ -1515,6 +2034,7 @@
             </w:tcMar>
           </w:tcPr>
           <w:p>
+            <w:proofErr w:type="spellStart"/>
             <w:r>
               <w:rPr>
                 <w:color w:val="333333"/>
@@ -1523,30 +2043,54 @@
               </w:rPr>
               <w:t>LightGBM</w:t>
             </w:r>
-            <w:r>
-              <w:rPr>
-                <w:color w:val="333333"/>
-                <w:sz w:val="18"/>
-                <w:szCs w:val="18"/>
-              </w:rPr>
-              <w:t>+ Optuna (0</w:t>
-            </w:r>
-            <w:r>
-              <w:rPr>
-                <w:color w:val="333333"/>
-                <w:sz w:val="18"/>
-                <w:szCs w:val="18"/>
-              </w:rPr>
-              <w:t>4</w:t>
-            </w:r>
-            <w:r>
-              <w:rPr>
-                <w:color w:val="333333"/>
-                <w:sz w:val="18"/>
-                <w:szCs w:val="18"/>
-              </w:rPr>
-              <w:t>_</w:t>
-            </w:r>
+            <w:proofErr w:type="spellEnd"/>
+            <w:r>
+              <w:rPr>
+                <w:color w:val="333333"/>
+                <w:sz w:val="18"/>
+                <w:szCs w:val="18"/>
+              </w:rPr>
+              <w:t xml:space="preserve">+ </w:t>
+            </w:r>
+            <w:proofErr w:type="spellStart"/>
+            <w:r>
+              <w:rPr>
+                <w:color w:val="333333"/>
+                <w:sz w:val="18"/>
+                <w:szCs w:val="18"/>
+              </w:rPr>
+              <w:t>Optuna</w:t>
+            </w:r>
+            <w:proofErr w:type="spellEnd"/>
+            <w:r>
+              <w:rPr>
+                <w:color w:val="333333"/>
+                <w:sz w:val="18"/>
+                <w:szCs w:val="18"/>
+              </w:rPr>
+              <w:t xml:space="preserve"> (04_LightGBM_Standalone)</w:t>
+            </w:r>
+          </w:p>
+        </w:tc>
+        <w:tc>
+          <w:tcPr>
+            <w:tcW w:w="3060" w:type="dxa"/>
+            <w:tcBorders>
+              <w:top w:val="single" w:sz="1" w:space="0" w:color="C0C0C0"/>
+              <w:left w:val="single" w:sz="1" w:space="0" w:color="C0C0C0"/>
+              <w:bottom w:val="single" w:sz="1" w:space="0" w:color="C0C0C0"/>
+              <w:right w:val="single" w:sz="1" w:space="0" w:color="C0C0C0"/>
+            </w:tcBorders>
+            <w:shd w:val="clear" w:color="auto" w:fill="F2F2F2"/>
+            <w:tcMar>
+              <w:top w:w="80" w:type="dxa"/>
+              <w:left w:w="120" w:type="dxa"/>
+              <w:bottom w:w="80" w:type="dxa"/>
+              <w:right w:w="120" w:type="dxa"/>
+            </w:tcMar>
+          </w:tcPr>
+          <w:p>
+            <w:proofErr w:type="spellStart"/>
             <w:r>
               <w:rPr>
                 <w:color w:val="333333"/>
@@ -1555,66 +2099,7 @@
               </w:rPr>
               <w:t>LightGBM</w:t>
             </w:r>
-            <w:r>
-              <w:rPr>
-                <w:color w:val="333333"/>
-                <w:sz w:val="18"/>
-                <w:szCs w:val="18"/>
-              </w:rPr>
-              <w:t>_Standalone)</w:t>
-            </w:r>
-          </w:p>
-        </w:tc>
-        <w:tc>
-          <w:tcPr>
-            <w:tcW w:w="3060" w:type="dxa"/>
-            <w:tcBorders>
-              <w:top w:val="single" w:sz="1" w:space="0" w:color="C0C0C0"/>
-              <w:left w:val="single" w:sz="1" w:space="0" w:color="C0C0C0"/>
-              <w:bottom w:val="single" w:sz="1" w:space="0" w:color="C0C0C0"/>
-              <w:right w:val="single" w:sz="1" w:space="0" w:color="C0C0C0"/>
-            </w:tcBorders>
-            <w:shd w:val="clear" w:color="auto" w:fill="F2F2F2"/>
-            <w:tcMar>
-              <w:top w:w="80" w:type="dxa"/>
-              <w:left w:w="120" w:type="dxa"/>
-              <w:bottom w:w="80" w:type="dxa"/>
-              <w:right w:w="120" w:type="dxa"/>
-            </w:tcMar>
-          </w:tcPr>
-          <w:p>
-            <w:r>
-              <w:rPr>
-                <w:color w:val="333333"/>
-                <w:sz w:val="18"/>
-                <w:szCs w:val="18"/>
-              </w:rPr>
-              <w:t>L</w:t>
-            </w:r>
-            <w:r>
-              <w:rPr>
-                <w:color w:val="333333"/>
-                <w:sz w:val="18"/>
-                <w:szCs w:val="18"/>
-              </w:rPr>
-              <w:t>ight</w:t>
-            </w:r>
-            <w:r>
-              <w:rPr>
-                <w:color w:val="333333"/>
-                <w:sz w:val="18"/>
-                <w:szCs w:val="18"/>
-              </w:rPr>
-              <w:t>GB</w:t>
-            </w:r>
-            <w:r>
-              <w:rPr>
-                <w:color w:val="333333"/>
-                <w:sz w:val="18"/>
-                <w:szCs w:val="18"/>
-              </w:rPr>
-              <w:t>M</w:t>
-            </w:r>
+            <w:proofErr w:type="spellEnd"/>
             <w:r>
               <w:rPr>
                 <w:color w:val="333333"/>
@@ -1627,7 +2112,7 @@
         </w:tc>
         <w:tc>
           <w:tcPr>
-            <w:tcW w:w="1981" w:type="dxa"/>
+            <w:tcW w:w="2430" w:type="dxa"/>
             <w:tcBorders>
               <w:top w:val="single" w:sz="1" w:space="0" w:color="C0C0C0"/>
               <w:left w:val="single" w:sz="1" w:space="0" w:color="C0C0C0"/>
@@ -1650,12 +2135,6 @@
         </w:tc>
       </w:tr>
       <w:tr>
-        <w:tblPrEx>
-          <w:tblCellMar>
-            <w:top w:w="0" w:type="dxa"/>
-            <w:bottom w:w="0" w:type="dxa"/>
-          </w:tblCellMar>
-        </w:tblPrEx>
         <w:tc>
           <w:tcPr>
             <w:tcW w:w="4319" w:type="dxa"/>
@@ -1674,6 +2153,7 @@
             </w:tcMar>
           </w:tcPr>
           <w:p>
+            <w:proofErr w:type="spellStart"/>
             <w:r>
               <w:rPr>
                 <w:color w:val="333333"/>
@@ -1682,29 +2162,32 @@
               </w:rPr>
               <w:t>CatBoost</w:t>
             </w:r>
-            <w:r>
-              <w:rPr>
-                <w:color w:val="333333"/>
-                <w:sz w:val="18"/>
-                <w:szCs w:val="18"/>
-              </w:rPr>
-              <w:t xml:space="preserve"> + Optuna (0</w:t>
-            </w:r>
-            <w:r>
-              <w:rPr>
-                <w:color w:val="333333"/>
-                <w:sz w:val="18"/>
-                <w:szCs w:val="18"/>
-              </w:rPr>
-              <w:t>5</w:t>
-            </w:r>
-            <w:r>
-              <w:rPr>
-                <w:color w:val="333333"/>
-                <w:sz w:val="18"/>
-                <w:szCs w:val="18"/>
-              </w:rPr>
-              <w:t>_XGBoost_Standalone)</w:t>
+            <w:proofErr w:type="spellEnd"/>
+            <w:r>
+              <w:rPr>
+                <w:color w:val="333333"/>
+                <w:sz w:val="18"/>
+                <w:szCs w:val="18"/>
+              </w:rPr>
+              <w:t xml:space="preserve"> + </w:t>
+            </w:r>
+            <w:proofErr w:type="spellStart"/>
+            <w:r>
+              <w:rPr>
+                <w:color w:val="333333"/>
+                <w:sz w:val="18"/>
+                <w:szCs w:val="18"/>
+              </w:rPr>
+              <w:t>Optuna</w:t>
+            </w:r>
+            <w:proofErr w:type="spellEnd"/>
+            <w:r>
+              <w:rPr>
+                <w:color w:val="333333"/>
+                <w:sz w:val="18"/>
+                <w:szCs w:val="18"/>
+              </w:rPr>
+              <w:t xml:space="preserve"> (05_XGBoost_Standalone)</w:t>
             </w:r>
           </w:p>
         </w:tc>
@@ -1726,19 +2209,29 @@
             </w:tcMar>
           </w:tcPr>
           <w:p>
-            <w:r>
-              <w:rPr>
-                <w:color w:val="333333"/>
-                <w:sz w:val="18"/>
-                <w:szCs w:val="18"/>
-              </w:rPr>
-              <w:t>CatBoost standalone benchmarks</w:t>
-            </w:r>
-          </w:p>
-        </w:tc>
-        <w:tc>
-          <w:tcPr>
-            <w:tcW w:w="1981" w:type="dxa"/>
+            <w:proofErr w:type="spellStart"/>
+            <w:r>
+              <w:rPr>
+                <w:color w:val="333333"/>
+                <w:sz w:val="18"/>
+                <w:szCs w:val="18"/>
+              </w:rPr>
+              <w:t>CatBoost</w:t>
+            </w:r>
+            <w:proofErr w:type="spellEnd"/>
+            <w:r>
+              <w:rPr>
+                <w:color w:val="333333"/>
+                <w:sz w:val="18"/>
+                <w:szCs w:val="18"/>
+              </w:rPr>
+              <w:t xml:space="preserve"> standalone benchmarks</w:t>
+            </w:r>
+          </w:p>
+        </w:tc>
+        <w:tc>
+          <w:tcPr>
+            <w:tcW w:w="2430" w:type="dxa"/>
             <w:tcBorders>
               <w:top w:val="single" w:sz="1" w:space="0" w:color="C0C0C0"/>
               <w:left w:val="single" w:sz="1" w:space="0" w:color="C0C0C0"/>
@@ -1761,12 +2254,6 @@
         </w:tc>
       </w:tr>
       <w:tr>
-        <w:tblPrEx>
-          <w:tblCellMar>
-            <w:top w:w="0" w:type="dxa"/>
-            <w:bottom w:w="0" w:type="dxa"/>
-          </w:tblCellMar>
-        </w:tblPrEx>
         <w:tc>
           <w:tcPr>
             <w:tcW w:w="4319" w:type="dxa"/>
@@ -1798,23 +2285,7 @@
                 <w:sz w:val="18"/>
                 <w:szCs w:val="18"/>
               </w:rPr>
-              <w:t>Full pipeline (0</w:t>
-            </w:r>
-            <w:r>
-              <w:rPr>
-                <w:color w:val="333333"/>
-                <w:sz w:val="18"/>
-                <w:szCs w:val="18"/>
-              </w:rPr>
-              <w:t>6</w:t>
-            </w:r>
-            <w:r>
-              <w:rPr>
-                <w:color w:val="333333"/>
-                <w:sz w:val="18"/>
-                <w:szCs w:val="18"/>
-              </w:rPr>
-              <w:t>_Full_Solution)</w:t>
+              <w:t>Full pipeline (06_Full_Solution)</w:t>
             </w:r>
           </w:p>
         </w:tc>
@@ -1855,7 +2326,7 @@
         </w:tc>
         <w:tc>
           <w:tcPr>
-            <w:tcW w:w="1981" w:type="dxa"/>
+            <w:tcW w:w="2430" w:type="dxa"/>
             <w:tcBorders>
               <w:top w:val="single" w:sz="1" w:space="0" w:color="C0C0C0"/>
               <w:left w:val="single" w:sz="1" w:space="0" w:color="C0C0C0"/>
@@ -1878,12 +2349,6 @@
         </w:tc>
       </w:tr>
       <w:tr>
-        <w:tblPrEx>
-          <w:tblCellMar>
-            <w:top w:w="0" w:type="dxa"/>
-            <w:bottom w:w="0" w:type="dxa"/>
-          </w:tblCellMar>
-        </w:tblPrEx>
         <w:tc>
           <w:tcPr>
             <w:tcW w:w="4319" w:type="dxa"/>
@@ -1915,55 +2380,7 @@
                 <w:sz w:val="18"/>
                 <w:szCs w:val="18"/>
               </w:rPr>
-              <w:t>Full pipeline</w:t>
-            </w:r>
-            <w:r>
-              <w:rPr>
-                <w:color w:val="333333"/>
-                <w:sz w:val="18"/>
-                <w:szCs w:val="18"/>
-              </w:rPr>
-              <w:t xml:space="preserve"> with Standard Scaler</w:t>
-            </w:r>
-            <w:r>
-              <w:rPr>
-                <w:color w:val="333333"/>
-                <w:sz w:val="18"/>
-                <w:szCs w:val="18"/>
-              </w:rPr>
-              <w:t xml:space="preserve"> (0</w:t>
-            </w:r>
-            <w:r>
-              <w:rPr>
-                <w:color w:val="333333"/>
-                <w:sz w:val="18"/>
-                <w:szCs w:val="18"/>
-              </w:rPr>
-              <w:t>7</w:t>
-            </w:r>
-            <w:r>
-              <w:rPr>
-                <w:color w:val="333333"/>
-                <w:sz w:val="18"/>
-                <w:szCs w:val="18"/>
-              </w:rPr>
-              <w:t>_Full_Solution</w:t>
-            </w:r>
-            <w:r>
-              <w:rPr>
-                <w:color w:val="333333"/>
-                <w:sz w:val="18"/>
-                <w:szCs w:val="18"/>
-              </w:rPr>
-              <w:t>_SS</w:t>
-            </w:r>
-            <w:r>
-              <w:rPr>
-                <w:color w:val="333333"/>
-                <w:sz w:val="18"/>
-                <w:szCs w:val="18"/>
-              </w:rPr>
-              <w:t>)</w:t>
+              <w:t>Full pipeline with Standard Scaler (07_Full_Solution_SS)</w:t>
             </w:r>
           </w:p>
         </w:tc>
@@ -1998,21 +2415,13 @@
                 <w:sz w:val="18"/>
                 <w:szCs w:val="18"/>
               </w:rPr>
-              <w:t>+ Target encoding, Grocery split, 3-model stack</w:t>
-            </w:r>
-            <w:r>
-              <w:rPr>
-                <w:color w:val="333333"/>
-                <w:sz w:val="18"/>
-                <w:szCs w:val="18"/>
-              </w:rPr>
-              <w:t xml:space="preserve"> using Standard Scalar</w:t>
-            </w:r>
-          </w:p>
-        </w:tc>
-        <w:tc>
-          <w:tcPr>
-            <w:tcW w:w="1981" w:type="dxa"/>
+              <w:t>+ Target encoding, Grocery split, 3-model stack using Standard Scalar</w:t>
+            </w:r>
+          </w:p>
+        </w:tc>
+        <w:tc>
+          <w:tcPr>
+            <w:tcW w:w="2430" w:type="dxa"/>
             <w:tcBorders>
               <w:top w:val="single" w:sz="1" w:space="0" w:color="C0C0C0"/>
               <w:left w:val="single" w:sz="1" w:space="0" w:color="C0C0C0"/>
@@ -2033,6 +2442,127 @@
             </w:r>
             <w:r>
               <w:t>.7031</w:t>
+            </w:r>
+          </w:p>
+        </w:tc>
+      </w:tr>
+      <w:tr>
+        <w:tc>
+          <w:tcPr>
+            <w:tcW w:w="4319" w:type="dxa"/>
+            <w:tcBorders>
+              <w:top w:val="single" w:sz="1" w:space="0" w:color="C0C0C0"/>
+              <w:left w:val="single" w:sz="1" w:space="0" w:color="C0C0C0"/>
+              <w:bottom w:val="single" w:sz="1" w:space="0" w:color="C0C0C0"/>
+              <w:right w:val="single" w:sz="1" w:space="0" w:color="C0C0C0"/>
+            </w:tcBorders>
+            <w:shd w:val="clear" w:color="auto" w:fill="F2F2F2"/>
+            <w:tcMar>
+              <w:top w:w="80" w:type="dxa"/>
+              <w:left w:w="120" w:type="dxa"/>
+              <w:bottom w:w="80" w:type="dxa"/>
+              <w:right w:w="120" w:type="dxa"/>
+            </w:tcMar>
+          </w:tcPr>
+          <w:p>
+            <w:pPr>
+              <w:rPr>
+                <w:color w:val="333333"/>
+                <w:sz w:val="18"/>
+                <w:szCs w:val="18"/>
+              </w:rPr>
+            </w:pPr>
+            <w:r>
+              <w:rPr>
+                <w:color w:val="333333"/>
+                <w:sz w:val="18"/>
+                <w:szCs w:val="18"/>
+              </w:rPr>
+              <w:t>Pseudo Label Added Iteration (08_Full_Solution_v8)</w:t>
+            </w:r>
+          </w:p>
+        </w:tc>
+        <w:tc>
+          <w:tcPr>
+            <w:tcW w:w="3060" w:type="dxa"/>
+            <w:tcBorders>
+              <w:top w:val="single" w:sz="1" w:space="0" w:color="C0C0C0"/>
+              <w:left w:val="single" w:sz="1" w:space="0" w:color="C0C0C0"/>
+              <w:bottom w:val="single" w:sz="1" w:space="0" w:color="C0C0C0"/>
+              <w:right w:val="single" w:sz="1" w:space="0" w:color="C0C0C0"/>
+            </w:tcBorders>
+            <w:shd w:val="clear" w:color="auto" w:fill="F2F2F2"/>
+            <w:tcMar>
+              <w:top w:w="80" w:type="dxa"/>
+              <w:left w:w="120" w:type="dxa"/>
+              <w:bottom w:w="80" w:type="dxa"/>
+              <w:right w:w="120" w:type="dxa"/>
+            </w:tcMar>
+          </w:tcPr>
+          <w:p>
+            <w:pPr>
+              <w:rPr>
+                <w:color w:val="333333"/>
+                <w:sz w:val="18"/>
+                <w:szCs w:val="18"/>
+              </w:rPr>
+            </w:pPr>
+            <w:r>
+              <w:rPr>
+                <w:color w:val="333333"/>
+                <w:sz w:val="18"/>
+                <w:szCs w:val="18"/>
+              </w:rPr>
+              <w:t xml:space="preserve">+ 3 new features + richer meta (5 inputs) + clip + pseudo-label + </w:t>
+            </w:r>
+            <w:proofErr w:type="spellStart"/>
+            <w:r>
+              <w:rPr>
+                <w:color w:val="333333"/>
+                <w:sz w:val="18"/>
+                <w:szCs w:val="18"/>
+              </w:rPr>
+              <w:t>Optuna</w:t>
+            </w:r>
+            <w:proofErr w:type="spellEnd"/>
+            <w:r>
+              <w:rPr>
+                <w:color w:val="333333"/>
+                <w:sz w:val="18"/>
+                <w:szCs w:val="18"/>
+              </w:rPr>
+              <w:t xml:space="preserve"> fixes</w:t>
+            </w:r>
+            <w:r>
+              <w:rPr>
+                <w:color w:val="333333"/>
+                <w:sz w:val="18"/>
+                <w:szCs w:val="18"/>
+              </w:rPr>
+              <w:tab/>
+            </w:r>
+          </w:p>
+        </w:tc>
+        <w:tc>
+          <w:tcPr>
+            <w:tcW w:w="2430" w:type="dxa"/>
+            <w:tcBorders>
+              <w:top w:val="single" w:sz="1" w:space="0" w:color="C0C0C0"/>
+              <w:left w:val="single" w:sz="1" w:space="0" w:color="C0C0C0"/>
+              <w:bottom w:val="single" w:sz="1" w:space="0" w:color="C0C0C0"/>
+              <w:right w:val="single" w:sz="1" w:space="0" w:color="C0C0C0"/>
+            </w:tcBorders>
+            <w:shd w:val="clear" w:color="auto" w:fill="F2F2F2"/>
+            <w:tcMar>
+              <w:top w:w="80" w:type="dxa"/>
+              <w:left w:w="120" w:type="dxa"/>
+              <w:bottom w:w="80" w:type="dxa"/>
+              <w:right w:w="120" w:type="dxa"/>
+            </w:tcMar>
+          </w:tcPr>
+          <w:p>
+            <w:r>
+              <w:t>1174.4941</w:t>
             </w:r>
           </w:p>
         </w:tc>
@@ -2047,12 +2577,97 @@
       <w:pPr>
         <w:spacing w:before="60" w:after="60" w:line="276" w:lineRule="auto"/>
         <w:jc w:val="both"/>
-      </w:pPr>
-      <w:r>
-        <w:rPr>
-          <w:color w:val="595959"/>
-        </w:rPr>
-        <w:t>The two highest-impact single changes across the entire pipeline were: (1) KFold target encoding of Item_Identifier and Outlet_Identifier, which directly injects historical sales signal; and (2) the Grocery Store hard split, which eliminates the model's need to reconcile a 10× sales scale difference within a single loss function.</w:t>
+        <w:rPr>
+          <w:color w:val="595959"/>
+        </w:rPr>
+      </w:pPr>
+      <w:r>
+        <w:rPr>
+          <w:color w:val="595959"/>
+        </w:rPr>
+        <w:t>The two highest-impact single changes across the entire pipeline were:</w:t>
+      </w:r>
+    </w:p>
+    <w:p>
+      <w:pPr>
+        <w:spacing w:before="60" w:after="60" w:line="276" w:lineRule="auto"/>
+        <w:jc w:val="both"/>
+        <w:rPr>
+          <w:color w:val="595959"/>
+        </w:rPr>
+      </w:pPr>
+    </w:p>
+    <w:p>
+      <w:pPr>
+        <w:pStyle w:val="ListParagraph"/>
+        <w:numPr>
+          <w:ilvl w:val="0"/>
+          <w:numId w:val="3"/>
+        </w:numPr>
+        <w:spacing w:before="60" w:after="60" w:line="276" w:lineRule="auto"/>
+        <w:jc w:val="both"/>
+        <w:rPr>
+          <w:color w:val="595959"/>
+        </w:rPr>
+      </w:pPr>
+      <w:proofErr w:type="spellStart"/>
+      <w:r>
+        <w:rPr>
+          <w:color w:val="595959"/>
+        </w:rPr>
+        <w:t>KFold</w:t>
+      </w:r>
+      <w:proofErr w:type="spellEnd"/>
+      <w:r>
+        <w:rPr>
+          <w:color w:val="595959"/>
+        </w:rPr>
+        <w:t xml:space="preserve"> target encoding of </w:t>
+      </w:r>
+      <w:proofErr w:type="spellStart"/>
+      <w:r>
+        <w:rPr>
+          <w:color w:val="595959"/>
+        </w:rPr>
+        <w:t>Item_Identifier</w:t>
+      </w:r>
+      <w:proofErr w:type="spellEnd"/>
+      <w:r>
+        <w:rPr>
+          <w:color w:val="595959"/>
+        </w:rPr>
+        <w:t xml:space="preserve"> and </w:t>
+      </w:r>
+      <w:proofErr w:type="spellStart"/>
+      <w:r>
+        <w:rPr>
+          <w:color w:val="595959"/>
+        </w:rPr>
+        <w:t>Outlet_Identifier</w:t>
+      </w:r>
+      <w:proofErr w:type="spellEnd"/>
+      <w:r>
+        <w:rPr>
+          <w:color w:val="595959"/>
+        </w:rPr>
+        <w:t>, which directly injects historical sales signal into model-readable features.</w:t>
+      </w:r>
+    </w:p>
+    <w:p>
+      <w:pPr>
+        <w:pStyle w:val="ListParagraph"/>
+        <w:numPr>
+          <w:ilvl w:val="0"/>
+          <w:numId w:val="3"/>
+        </w:numPr>
+        <w:spacing w:before="60" w:after="60" w:line="276" w:lineRule="auto"/>
+        <w:jc w:val="both"/>
+      </w:pPr>
+      <w:r>
+        <w:rPr>
+          <w:color w:val="595959"/>
+        </w:rPr>
+        <w:t>Grocery Store hard split, which eliminates the model's need to reconcile a 10× sales scale difference within a single loss function.</w:t>
       </w:r>
     </w:p>
     <w:sectPr>
@@ -2097,13 +2712,23 @@
       </w:tabs>
       <w:spacing w:before="60"/>
     </w:pPr>
+    <w:proofErr w:type="spellStart"/>
     <w:r>
       <w:rPr>
         <w:color w:val="595959"/>
         <w:sz w:val="16"/>
         <w:szCs w:val="16"/>
       </w:rPr>
-      <w:t>BigMart Sales Prediction — Approach Note</w:t>
+      <w:t>BigMart</w:t>
+    </w:r>
+    <w:proofErr w:type="spellEnd"/>
+    <w:r>
+      <w:rPr>
+        <w:color w:val="595959"/>
+        <w:sz w:val="16"/>
+        <w:szCs w:val="16"/>
+      </w:rPr>
+      <w:t xml:space="preserve"> Sales Prediction — Approach Note</w:t>
     </w:r>
     <w:r>
       <w:rPr>
@@ -2146,6 +2771,119 @@
 <file path=word/numbering.xml><?xml version="1.0" encoding="utf-8"?>
 <w:numbering xmlns:wpc="http://schemas.microsoft.com/office/word/2010/wordprocessingCanvas" xmlns:cx="http://schemas.microsoft.com/office/drawing/2014/chartex" xmlns:cx1="http://schemas.microsoft.com/office/drawing/2015/9/8/chartex" xmlns:cx2="http://schemas.microsoft.com/office/drawing/2015/10/21/chartex" xmlns:cx3="http://schemas.microsoft.com/office/drawing/2016/5/9/chartex" xmlns:cx4="http://schemas.microsoft.com/office/drawing/2016/5/10/chartex" xmlns:cx5="http://schemas.microsoft.com/office/drawing/2016/5/11/chartex" xmlns:cx6="http://schemas.microsoft.com/office/drawing/2016/5/12/chartex" xmlns:cx7="http://schemas.microsoft.com/office/drawing/2016/5/13/chartex" xmlns:cx8="http://schemas.microsoft.com/office/drawing/2016/5/14/chartex" xmlns:mc="http://schemas.openxmlformats.org/markup-compatibility/2006" xmlns:aink="http://schemas.microsoft.com/office/drawing/2016/ink" xmlns:am3d="http://schemas.microsoft.com/office/drawing/2017/model3d" xmlns:o="urn:schemas-microsoft-com:office:office" xmlns:oel="http://schemas.microsoft.com/office/2019/extlst" xmlns:r="http://schemas.openxmlformats.org/officeDocument/2006/relationships" xmlns:m="http://schemas.openxmlformats.org/officeDocument/2006/math" xmlns:v="urn:schemas-microsoft-com:vml" xmlns:wp14="http://schemas.microsoft.com/office/word/2010/wordprocessingDrawing" xmlns:wp="http://schemas.openxmlformats.org/drawingml/2006/wordprocessingDrawing" xmlns:w10="urn:schemas-microsoft-com:office:word" xmlns:w="http://schemas.openxmlformats.org/wordprocessingml/2006/main" xmlns:w14="http://schemas.microsoft.com/office/word/2010/wordml" xmlns:w15="http://schemas.microsoft.com/office/word/2012/wordml" xmlns:w16cex="http://schemas.microsoft.com/office/word/2018/wordml/cex" xmlns:w16cid="http://schemas.microsoft.com/office/word/2016/wordml/cid" xmlns:w16="http://schemas.microsoft.com/office/word/2018/wordml" xmlns:w16du="http://schemas.microsoft.com/office/word/2023/wordml/word16du" xmlns:w16sdtdh="http://schemas.microsoft.com/office/word/2020/wordml/sdtdatahash" xmlns:w16sdtfl="http://schemas.microsoft.com/office/word/2024/wordml/sdtformatlock" xmlns:w16se="http://schemas.microsoft.com/office/word/2015/wordml/symex" xmlns:wpg="http://schemas.microsoft.com/office/word/2010/wordprocessingGroup" xmlns:wpi="http://schemas.microsoft.com/office/word/2010/wordprocessingInk" xmlns:wne="http://schemas.microsoft.com/office/word/2006/wordml" xmlns:wps="http://schemas.microsoft.com/office/word/2010/wordprocessingShape" mc:Ignorable="w14 w15 w16se w16cid w16 w16cex w16sdtdh w16sdtfl w16du wp14">
   <w:abstractNum w:abstractNumId="0" w15:restartNumberingAfterBreak="0">
+    <w:nsid w:val="201C7CBC"/>
+    <w:multiLevelType w:val="hybridMultilevel"/>
+    <w:tmpl w:val="2AC087DC"/>
+    <w:lvl w:ilvl="0" w:tplc="04090001">
+      <w:start w:val="1"/>
+      <w:numFmt w:val="bullet"/>
+      <w:lvlText w:val=""/>
+      <w:lvlJc w:val="left"/>
+      <w:pPr>
+        <w:ind w:left="720" w:hanging="360"/>
+      </w:pPr>
+      <w:rPr>
+        <w:rFonts w:ascii="Symbol" w:hAnsi="Symbol" w:hint="default"/>
+      </w:rPr>
+    </w:lvl>
+    <w:lvl w:ilvl="1" w:tplc="04090003" w:tentative="1">
+      <w:start w:val="1"/>
+      <w:numFmt w:val="bullet"/>
+      <w:lvlText w:val="o"/>
+      <w:lvlJc w:val="left"/>
+      <w:pPr>
+        <w:ind w:left="1440" w:hanging="360"/>
+      </w:pPr>
+      <w:rPr>
+        <w:rFonts w:ascii="Courier New" w:hAnsi="Courier New" w:cs="Courier New" w:hint="default"/>
+      </w:rPr>
+    </w:lvl>
+    <w:lvl w:ilvl="2" w:tplc="04090005" w:tentative="1">
+      <w:start w:val="1"/>
+      <w:numFmt w:val="bullet"/>
+      <w:lvlText w:val=""/>
+      <w:lvlJc w:val="left"/>
+      <w:pPr>
+        <w:ind w:left="2160" w:hanging="360"/>
+      </w:pPr>
+      <w:rPr>
+        <w:rFonts w:ascii="Wingdings" w:hAnsi="Wingdings" w:hint="default"/>
+      </w:rPr>
+    </w:lvl>
+    <w:lvl w:ilvl="3" w:tplc="04090001" w:tentative="1">
+      <w:start w:val="1"/>
+      <w:numFmt w:val="bullet"/>
+      <w:lvlText w:val=""/>
+      <w:lvlJc w:val="left"/>
+      <w:pPr>
+        <w:ind w:left="2880" w:hanging="360"/>
+      </w:pPr>
+      <w:rPr>
+        <w:rFonts w:ascii="Symbol" w:hAnsi="Symbol" w:hint="default"/>
+      </w:rPr>
+    </w:lvl>
+    <w:lvl w:ilvl="4" w:tplc="04090003" w:tentative="1">
+      <w:start w:val="1"/>
+      <w:numFmt w:val="bullet"/>
+      <w:lvlText w:val="o"/>
+      <w:lvlJc w:val="left"/>
+      <w:pPr>
+        <w:ind w:left="3600" w:hanging="360"/>
+      </w:pPr>
+      <w:rPr>
+        <w:rFonts w:ascii="Courier New" w:hAnsi="Courier New" w:cs="Courier New" w:hint="default"/>
+      </w:rPr>
+    </w:lvl>
+    <w:lvl w:ilvl="5" w:tplc="04090005" w:tentative="1">
+      <w:start w:val="1"/>
+      <w:numFmt w:val="bullet"/>
+      <w:lvlText w:val=""/>
+      <w:lvlJc w:val="left"/>
+      <w:pPr>
+        <w:ind w:left="4320" w:hanging="360"/>
+      </w:pPr>
+      <w:rPr>
+        <w:rFonts w:ascii="Wingdings" w:hAnsi="Wingdings" w:hint="default"/>
+      </w:rPr>
+    </w:lvl>
+    <w:lvl w:ilvl="6" w:tplc="04090001" w:tentative="1">
+      <w:start w:val="1"/>
+      <w:numFmt w:val="bullet"/>
+      <w:lvlText w:val=""/>
+      <w:lvlJc w:val="left"/>
+      <w:pPr>
+        <w:ind w:left="5040" w:hanging="360"/>
+      </w:pPr>
+      <w:rPr>
+        <w:rFonts w:ascii="Symbol" w:hAnsi="Symbol" w:hint="default"/>
+      </w:rPr>
+    </w:lvl>
+    <w:lvl w:ilvl="7" w:tplc="04090003" w:tentative="1">
+      <w:start w:val="1"/>
+      <w:numFmt w:val="bullet"/>
+      <w:lvlText w:val="o"/>
+      <w:lvlJc w:val="left"/>
+      <w:pPr>
+        <w:ind w:left="5760" w:hanging="360"/>
+      </w:pPr>
+      <w:rPr>
+        <w:rFonts w:ascii="Courier New" w:hAnsi="Courier New" w:cs="Courier New" w:hint="default"/>
+      </w:rPr>
+    </w:lvl>
+    <w:lvl w:ilvl="8" w:tplc="04090005" w:tentative="1">
+      <w:start w:val="1"/>
+      <w:numFmt w:val="bullet"/>
+      <w:lvlText w:val=""/>
+      <w:lvlJc w:val="left"/>
+      <w:pPr>
+        <w:ind w:left="6480" w:hanging="360"/>
+      </w:pPr>
+      <w:rPr>
+        <w:rFonts w:ascii="Wingdings" w:hAnsi="Wingdings" w:hint="default"/>
+      </w:rPr>
+    </w:lvl>
+  </w:abstractNum>
+  <w:abstractNum w:abstractNumId="1" w15:restartNumberingAfterBreak="0">
     <w:nsid w:val="562C19B6"/>
     <w:multiLevelType w:val="hybridMultilevel"/>
     <w:tmpl w:val="336AC404"/>
@@ -2200,7 +2938,7 @@
       <w:lvlJc w:val="left"/>
     </w:lvl>
   </w:abstractNum>
-  <w:abstractNum w:abstractNumId="1" w15:restartNumberingAfterBreak="0">
+  <w:abstractNum w:abstractNumId="2" w15:restartNumberingAfterBreak="0">
     <w:nsid w:val="590D0206"/>
     <w:multiLevelType w:val="hybridMultilevel"/>
     <w:tmpl w:val="2320D122"/>
@@ -2287,16 +3025,19 @@
     </w:lvl>
   </w:abstractNum>
   <w:num w:numId="1" w16cid:durableId="1237594210">
+    <w:abstractNumId w:val="2"/>
+    <w:lvlOverride w:ilvl="0">
+      <w:startOverride w:val="1"/>
+    </w:lvlOverride>
+  </w:num>
+  <w:num w:numId="2" w16cid:durableId="165678433">
     <w:abstractNumId w:val="1"/>
     <w:lvlOverride w:ilvl="0">
       <w:startOverride w:val="1"/>
     </w:lvlOverride>
   </w:num>
-  <w:num w:numId="2" w16cid:durableId="165678433">
+  <w:num w:numId="3" w16cid:durableId="4672544">
     <w:abstractNumId w:val="0"/>
-    <w:lvlOverride w:ilvl="0">
-      <w:startOverride w:val="1"/>
-    </w:lvlOverride>
   </w:num>
 </w:numbering>
 </file>
@@ -2786,6 +3527,7 @@
   <w:style w:type="character" w:default="1" w:styleId="DefaultParagraphFont">
     <w:name w:val="Default Paragraph Font"/>
     <w:uiPriority w:val="1"/>
+    <w:semiHidden/>
     <w:unhideWhenUsed/>
   </w:style>
   <w:style w:type="table" w:default="1" w:styleId="TableNormal">

</xml_diff>